<commit_message>
Update template with user fixes
</commit_message>
<xml_diff>
--- a/LP_template2.docx
+++ b/LP_template2.docx
@@ -742,7 +742,7 @@
       <w:r>
         <w:rPr>
           <w:b/>
-          <w:color w:val="EE0000"/>
+          <w:color w:val="000000" w:themeColor="text1"/>
           <w:sz w:val="24"/>
         </w:rPr>
         <w:t>{</w:t>
@@ -751,7 +751,7 @@
       <w:r>
         <w:rPr>
           <w:b/>
-          <w:color w:val="EE0000"/>
+          <w:color w:val="000000" w:themeColor="text1"/>
           <w:sz w:val="24"/>
         </w:rPr>
         <w:t>uvazek</w:t>
@@ -760,7 +760,7 @@
       <w:r>
         <w:rPr>
           <w:b/>
-          <w:color w:val="EE0000"/>
+          <w:color w:val="000000" w:themeColor="text1"/>
           <w:sz w:val="24"/>
         </w:rPr>
         <w:t>}</w:t>
@@ -789,7 +789,7 @@
       <w:r>
         <w:rPr>
           <w:b/>
-          <w:color w:val="EE0000"/>
+          <w:color w:val="000000" w:themeColor="text1"/>
           <w:sz w:val="24"/>
         </w:rPr>
         <w:t>{</w:t>
@@ -798,7 +798,7 @@
       <w:r>
         <w:rPr>
           <w:b/>
-          <w:color w:val="EE0000"/>
+          <w:color w:val="000000" w:themeColor="text1"/>
           <w:sz w:val="24"/>
         </w:rPr>
         <w:t>cinnosti</w:t>
@@ -807,7 +807,7 @@
       <w:r>
         <w:rPr>
           <w:b/>
-          <w:color w:val="EE0000"/>
+          <w:color w:val="000000" w:themeColor="text1"/>
           <w:sz w:val="24"/>
         </w:rPr>
         <w:t>}</w:t>
@@ -830,7 +830,7 @@
       <w:r>
         <w:rPr>
           <w:b/>
-          <w:color w:val="EE0000"/>
+          <w:color w:val="000000" w:themeColor="text1"/>
           <w:sz w:val="24"/>
         </w:rPr>
         <w:t>{</w:t>
@@ -839,7 +839,7 @@
       <w:r>
         <w:rPr>
           <w:b/>
-          <w:color w:val="EE0000"/>
+          <w:color w:val="000000" w:themeColor="text1"/>
           <w:sz w:val="24"/>
         </w:rPr>
         <w:t>rezim</w:t>
@@ -848,7 +848,7 @@
       <w:r>
         <w:rPr>
           <w:b/>
-          <w:color w:val="EE0000"/>
+          <w:color w:val="000000" w:themeColor="text1"/>
           <w:sz w:val="24"/>
         </w:rPr>
         <w:t>}</w:t>
@@ -877,7 +877,7 @@
       <w:r>
         <w:rPr>
           <w:b/>
-          <w:color w:val="EE0000"/>
+          <w:color w:val="000000" w:themeColor="text1"/>
           <w:sz w:val="24"/>
         </w:rPr>
         <w:t>{</w:t>
@@ -886,7 +886,7 @@
       <w:r>
         <w:rPr>
           <w:b/>
-          <w:color w:val="EE0000"/>
+          <w:color w:val="000000" w:themeColor="text1"/>
           <w:sz w:val="24"/>
         </w:rPr>
         <w:t>delkasmeny</w:t>
@@ -895,7 +895,7 @@
       <w:r>
         <w:rPr>
           <w:b/>
-          <w:color w:val="EE0000"/>
+          <w:color w:val="000000" w:themeColor="text1"/>
           <w:sz w:val="24"/>
         </w:rPr>
         <w:t>}</w:t>
@@ -968,7 +968,7 @@
       <w:r>
         <w:rPr>
           <w:b/>
-          <w:color w:val="EE0000"/>
+          <w:color w:val="000000" w:themeColor="text1"/>
           <w:sz w:val="24"/>
         </w:rPr>
         <w:t>{</w:t>
@@ -977,7 +977,7 @@
       <w:r>
         <w:rPr>
           <w:b/>
-          <w:color w:val="EE0000"/>
+          <w:color w:val="000000" w:themeColor="text1"/>
           <w:sz w:val="24"/>
         </w:rPr>
         <w:t>kategorieprace</w:t>
@@ -986,7 +986,7 @@
       <w:r>
         <w:rPr>
           <w:b/>
-          <w:color w:val="EE0000"/>
+          <w:color w:val="000000" w:themeColor="text1"/>
           <w:sz w:val="24"/>
         </w:rPr>
         <w:t>}</w:t>

</xml_diff>